<commit_message>
Melhorias feitas no código
</commit_message>
<xml_diff>
--- a/relatorio_final/relatorio_final_completo.docx
+++ b/relatorio_final/relatorio_final_completo.docx
@@ -35,8 +35,20 @@
           <w:sz w:val="36"/>
           <w:szCs w:val="36"/>
         </w:rPr>
-        <w:t>Desafio de Dados — LH Nautical</w:t>
-      </w:r>
+        <w:t xml:space="preserve">Desafio de Dados — LH </w:t>
+      </w:r>
+      <w:proofErr w:type="spellStart"/>
+      <w:r>
+        <w:rPr>
+          <w:b/>
+          <w:bCs/>
+          <w:color w:val="534AB7"/>
+          <w:sz w:val="36"/>
+          <w:szCs w:val="36"/>
+        </w:rPr>
+        <w:t>Nautical</w:t>
+      </w:r>
+      <w:proofErr w:type="spellEnd"/>
     </w:p>
     <w:p>
       <w:pPr>
@@ -94,8 +106,42 @@
             <w:sz w:val="20"/>
             <w:szCs w:val="20"/>
           </w:rPr>
-          <w:t>github.com/JoseNeto1981/lh-nautical-challenge</w:t>
+          <w:t>github.com/JoseNeto1981/lh-</w:t>
         </w:r>
+        <w:proofErr w:type="spellStart"/>
+        <w:r>
+          <w:rPr>
+            <w:rStyle w:val="Hyperlink"/>
+            <w:i/>
+            <w:iCs/>
+            <w:sz w:val="20"/>
+            <w:szCs w:val="20"/>
+          </w:rPr>
+          <w:t>nautical</w:t>
+        </w:r>
+        <w:proofErr w:type="spellEnd"/>
+        <w:r>
+          <w:rPr>
+            <w:rStyle w:val="Hyperlink"/>
+            <w:i/>
+            <w:iCs/>
+            <w:sz w:val="20"/>
+            <w:szCs w:val="20"/>
+          </w:rPr>
+          <w:t>-</w:t>
+        </w:r>
+        <w:proofErr w:type="spellStart"/>
+        <w:r>
+          <w:rPr>
+            <w:rStyle w:val="Hyperlink"/>
+            <w:i/>
+            <w:iCs/>
+            <w:sz w:val="20"/>
+            <w:szCs w:val="20"/>
+          </w:rPr>
+          <w:t>challenge</w:t>
+        </w:r>
+        <w:proofErr w:type="spellEnd"/>
       </w:hyperlink>
     </w:p>
     <w:p>
@@ -132,7 +178,21 @@
         <w:rPr>
           <w:color w:val="2C2C2A"/>
         </w:rPr>
-        <w:t>Este relatório consolida as frentes de trabalho do desafio técnico da LH Nautical, cobrindo o ciclo completo de dados — da ingestão bruta de 24 arquivos CSV à geração de insights preditivos e um sistema de recomendação. O objetivo foi transformar uma base de dados desorganizada em uma fonte confiável de decisão para a diretoria, com clareza técnica e impacto de negócio mensurável em cada etapa, seguindo as premissas definidas pelo Tech Lead Gabriel Santos.</w:t>
+        <w:t xml:space="preserve">Este relatório consolida as frentes de trabalho do desafio técnico da LH </w:t>
+      </w:r>
+      <w:proofErr w:type="spellStart"/>
+      <w:r>
+        <w:rPr>
+          <w:color w:val="2C2C2A"/>
+        </w:rPr>
+        <w:t>Nautical</w:t>
+      </w:r>
+      <w:proofErr w:type="spellEnd"/>
+      <w:r>
+        <w:rPr>
+          <w:color w:val="2C2C2A"/>
+        </w:rPr>
+        <w:t>, cobrindo o ciclo completo de dados — da ingestão bruta de 24 arquivos CSV à geração de insights preditivos e um sistema de recomendação. O objetivo foi transformar uma base de dados desorganizada em uma fonte confiável de decisão para a diretoria, com clareza técnica e impacto de negócio mensurável em cada etapa, seguindo as premissas definidas pelo Tech Lead Gabriel Santos.</w:t>
       </w:r>
     </w:p>
     <w:p>
@@ -163,7 +223,49 @@
         <w:rPr>
           <w:color w:val="2C2C2A"/>
         </w:rPr>
-        <w:t>Tratamento de Dados (EDA, Schema e Carregamento): diagnóstico de qualidade dos dados brutos, geração automatizada de schema PostgreSQL a partir dos CSVs, e carga completa de 251.864 linhas em um banco relacional real, rodando em container Docker.</w:t>
+        <w:t xml:space="preserve">Tratamento de Dados (EDA, </w:t>
+      </w:r>
+      <w:proofErr w:type="spellStart"/>
+      <w:r>
+        <w:rPr>
+          <w:color w:val="2C2C2A"/>
+        </w:rPr>
+        <w:t>Schema</w:t>
+      </w:r>
+      <w:proofErr w:type="spellEnd"/>
+      <w:r>
+        <w:rPr>
+          <w:color w:val="2C2C2A"/>
+        </w:rPr>
+        <w:t xml:space="preserve"> e Carregamento): diagnóstico de qualidade dos dados brutos, geração automatizada de </w:t>
+      </w:r>
+      <w:proofErr w:type="spellStart"/>
+      <w:r>
+        <w:rPr>
+          <w:color w:val="2C2C2A"/>
+        </w:rPr>
+        <w:t>schema</w:t>
+      </w:r>
+      <w:proofErr w:type="spellEnd"/>
+      <w:r>
+        <w:rPr>
+          <w:color w:val="2C2C2A"/>
+        </w:rPr>
+        <w:t xml:space="preserve"> PostgreSQL a partir dos </w:t>
+      </w:r>
+      <w:proofErr w:type="spellStart"/>
+      <w:r>
+        <w:rPr>
+          <w:color w:val="2C2C2A"/>
+        </w:rPr>
+        <w:t>CSVs</w:t>
+      </w:r>
+      <w:proofErr w:type="spellEnd"/>
+      <w:r>
+        <w:rPr>
+          <w:color w:val="2C2C2A"/>
+        </w:rPr>
+        <w:t>, e carga completa de 251.864 linhas em um banco relacional real, rodando em container Docker.</w:t>
       </w:r>
     </w:p>
     <w:p>
@@ -220,12 +322,6 @@
         <w:gridCol w:w="2400"/>
       </w:tblGrid>
       <w:tr>
-        <w:tblPrEx>
-          <w:tblCellMar>
-            <w:top w:w="0" w:type="dxa"/>
-            <w:bottom w:w="0" w:type="dxa"/>
-          </w:tblCellMar>
-        </w:tblPrEx>
         <w:trPr>
           <w:tblHeader/>
         </w:trPr>
@@ -269,6 +365,37 @@
           <w:p>
             <w:pPr>
               <w:jc w:val="center"/>
+              <w:rPr>
+                <w:b/>
+                <w:bCs/>
+              </w:rPr>
+            </w:pPr>
+            <w:r>
+              <w:rPr>
+                <w:b/>
+                <w:bCs/>
+                <w:sz w:val="20"/>
+                <w:szCs w:val="20"/>
+              </w:rPr>
+              <w:t>Insights</w:t>
+            </w:r>
+          </w:p>
+        </w:tc>
+        <w:tc>
+          <w:tcPr>
+            <w:tcW w:w="2400" w:type="dxa"/>
+            <w:shd w:val="clear" w:color="auto" w:fill="26215C"/>
+            <w:tcMar>
+              <w:top w:w="80" w:type="dxa"/>
+              <w:left w:w="120" w:type="dxa"/>
+              <w:bottom w:w="80" w:type="dxa"/>
+              <w:right w:w="120" w:type="dxa"/>
+            </w:tcMar>
+            <w:vAlign w:val="center"/>
+          </w:tcPr>
+          <w:p>
+            <w:pPr>
+              <w:jc w:val="center"/>
             </w:pPr>
             <w:r>
               <w:rPr>
@@ -278,46 +405,12 @@
                 <w:sz w:val="20"/>
                 <w:szCs w:val="20"/>
               </w:rPr>
-              <w:t>Achado</w:t>
-            </w:r>
-          </w:p>
-        </w:tc>
-        <w:tc>
-          <w:tcPr>
-            <w:tcW w:w="2400" w:type="dxa"/>
-            <w:shd w:val="clear" w:color="auto" w:fill="26215C"/>
-            <w:tcMar>
-              <w:top w:w="80" w:type="dxa"/>
-              <w:left w:w="120" w:type="dxa"/>
-              <w:bottom w:w="80" w:type="dxa"/>
-              <w:right w:w="120" w:type="dxa"/>
-            </w:tcMar>
-            <w:vAlign w:val="center"/>
-          </w:tcPr>
-          <w:p>
-            <w:pPr>
-              <w:jc w:val="center"/>
-            </w:pPr>
-            <w:r>
-              <w:rPr>
-                <w:b/>
-                <w:bCs/>
-                <w:color w:val="FFFFFF"/>
-                <w:sz w:val="20"/>
-                <w:szCs w:val="20"/>
-              </w:rPr>
               <w:t>Impacto</w:t>
             </w:r>
           </w:p>
         </w:tc>
       </w:tr>
       <w:tr>
-        <w:tblPrEx>
-          <w:tblCellMar>
-            <w:top w:w="0" w:type="dxa"/>
-            <w:bottom w:w="0" w:type="dxa"/>
-          </w:tblCellMar>
-        </w:tblPrEx>
         <w:tc>
           <w:tcPr>
             <w:tcW w:w="600" w:type="dxa"/>
@@ -392,12 +485,6 @@
         </w:tc>
       </w:tr>
       <w:tr>
-        <w:tblPrEx>
-          <w:tblCellMar>
-            <w:top w:w="0" w:type="dxa"/>
-            <w:bottom w:w="0" w:type="dxa"/>
-          </w:tblCellMar>
-        </w:tblPrEx>
         <w:tc>
           <w:tcPr>
             <w:tcW w:w="600" w:type="dxa"/>
@@ -475,12 +562,6 @@
         </w:tc>
       </w:tr>
       <w:tr>
-        <w:tblPrEx>
-          <w:tblCellMar>
-            <w:top w:w="0" w:type="dxa"/>
-            <w:bottom w:w="0" w:type="dxa"/>
-          </w:tblCellMar>
-        </w:tblPrEx>
         <w:tc>
           <w:tcPr>
             <w:tcW w:w="600" w:type="dxa"/>
@@ -555,12 +636,6 @@
         </w:tc>
       </w:tr>
       <w:tr>
-        <w:tblPrEx>
-          <w:tblCellMar>
-            <w:top w:w="0" w:type="dxa"/>
-            <w:bottom w:w="0" w:type="dxa"/>
-          </w:tblCellMar>
-        </w:tblPrEx>
         <w:tc>
           <w:tcPr>
             <w:tcW w:w="600" w:type="dxa"/>
@@ -638,12 +713,6 @@
         </w:tc>
       </w:tr>
       <w:tr>
-        <w:tblPrEx>
-          <w:tblCellMar>
-            <w:top w:w="0" w:type="dxa"/>
-            <w:bottom w:w="0" w:type="dxa"/>
-          </w:tblCellMar>
-        </w:tblPrEx>
         <w:tc>
           <w:tcPr>
             <w:tcW w:w="600" w:type="dxa"/>
@@ -712,8 +781,18 @@
                 <w:sz w:val="20"/>
                 <w:szCs w:val="20"/>
               </w:rPr>
-              <w:t>Estratégia de cross-sell</w:t>
-            </w:r>
+              <w:t xml:space="preserve">Estratégia de </w:t>
+            </w:r>
+            <w:proofErr w:type="spellStart"/>
+            <w:r>
+              <w:rPr>
+                <w:color w:val="2C2C2A"/>
+                <w:sz w:val="20"/>
+                <w:szCs w:val="20"/>
+              </w:rPr>
+              <w:t>cross-sell</w:t>
+            </w:r>
+            <w:proofErr w:type="spellEnd"/>
           </w:p>
         </w:tc>
       </w:tr>
@@ -768,7 +847,35 @@
         <w:rPr>
           <w:color w:val="2C2C2A"/>
         </w:rPr>
-        <w:t>O desafio foi resolvido como um pipeline de dados de ponta a ponta, passando por cinco etapas principais: leitura dos CSVs brutos, exploração inicial, modelagem de schema, carga em um banco relacional real (PostgreSQL, rodando em Docker), e finalmente as quatro análises de negócio solicitadas.</w:t>
+        <w:t xml:space="preserve">O desafio foi resolvido como um pipeline de dados de ponta a ponta, passando por cinco etapas principais: leitura dos </w:t>
+      </w:r>
+      <w:proofErr w:type="spellStart"/>
+      <w:r>
+        <w:rPr>
+          <w:color w:val="2C2C2A"/>
+        </w:rPr>
+        <w:t>CSVs</w:t>
+      </w:r>
+      <w:proofErr w:type="spellEnd"/>
+      <w:r>
+        <w:rPr>
+          <w:color w:val="2C2C2A"/>
+        </w:rPr>
+        <w:t xml:space="preserve"> brutos, exploração inicial, modelagem de </w:t>
+      </w:r>
+      <w:proofErr w:type="spellStart"/>
+      <w:r>
+        <w:rPr>
+          <w:color w:val="2C2C2A"/>
+        </w:rPr>
+        <w:t>schema</w:t>
+      </w:r>
+      <w:proofErr w:type="spellEnd"/>
+      <w:r>
+        <w:rPr>
+          <w:color w:val="2C2C2A"/>
+        </w:rPr>
+        <w:t>, carga em um banco relacional real (PostgreSQL, rodando em Docker), e finalmente as quatro análises de negócio solicitadas.</w:t>
       </w:r>
     </w:p>
     <w:p>
@@ -845,7 +952,49 @@
         <w:rPr>
           <w:color w:val="2C2C2A"/>
         </w:rPr>
-        <w:t>O Tratamento de Dados (EDA, Schema e Carregamento) seguiu um caminho técnico específico: a EDA inicial foi feita com DuckDB direto sobre os arquivos CSV (sem precisar de banco ainda), a geração do schema usou exclusivamente bibliotecas nativas do Python, e a carga final usou o comando COPY nativo do PostgreSQL via psycopg2, orquestrado por um container Docker.</w:t>
+        <w:t xml:space="preserve">O Tratamento de Dados (EDA, </w:t>
+      </w:r>
+      <w:proofErr w:type="spellStart"/>
+      <w:r>
+        <w:rPr>
+          <w:color w:val="2C2C2A"/>
+        </w:rPr>
+        <w:t>Schema</w:t>
+      </w:r>
+      <w:proofErr w:type="spellEnd"/>
+      <w:r>
+        <w:rPr>
+          <w:color w:val="2C2C2A"/>
+        </w:rPr>
+        <w:t xml:space="preserve"> e Carregamento) seguiu um caminho técnico específico: a EDA inicial foi feita com </w:t>
+      </w:r>
+      <w:proofErr w:type="spellStart"/>
+      <w:r>
+        <w:rPr>
+          <w:color w:val="2C2C2A"/>
+        </w:rPr>
+        <w:t>DuckDB</w:t>
+      </w:r>
+      <w:proofErr w:type="spellEnd"/>
+      <w:r>
+        <w:rPr>
+          <w:color w:val="2C2C2A"/>
+        </w:rPr>
+        <w:t xml:space="preserve"> direto sobre os arquivos CSV (sem precisar de banco ainda), a geração do </w:t>
+      </w:r>
+      <w:proofErr w:type="spellStart"/>
+      <w:r>
+        <w:rPr>
+          <w:color w:val="2C2C2A"/>
+        </w:rPr>
+        <w:t>schema</w:t>
+      </w:r>
+      <w:proofErr w:type="spellEnd"/>
+      <w:r>
+        <w:rPr>
+          <w:color w:val="2C2C2A"/>
+        </w:rPr>
+        <w:t xml:space="preserve"> usou exclusivamente bibliotecas nativas do Python, e a carga final usou o comando COPY nativo do PostgreSQL via psycopg2, orquestrado por um container Docker.</w:t>
       </w:r>
     </w:p>
     <w:p>
@@ -922,7 +1071,21 @@
         <w:rPr>
           <w:color w:val="2C2C2A"/>
         </w:rPr>
-        <w:t>As frentes de Análise de Clientes, Análise de Vendas, Previsão de Demanda e Sistemas de Recomendação partiram todas do mesmo banco já carregado, cada uma aplicando uma técnica diferente — desde SQL analítico com CTEs até um modelo preditivo simples e um sistema de recomendação com similaridade de cosseno.</w:t>
+        <w:t xml:space="preserve">As frentes de Análise de Clientes, Análise de Vendas, Previsão de Demanda e Sistemas de Recomendação partiram todas do mesmo banco já carregado, cada uma aplicando uma técnica diferente — desde SQL analítico com </w:t>
+      </w:r>
+      <w:proofErr w:type="spellStart"/>
+      <w:r>
+        <w:rPr>
+          <w:color w:val="2C2C2A"/>
+        </w:rPr>
+        <w:t>CTEs</w:t>
+      </w:r>
+      <w:proofErr w:type="spellEnd"/>
+      <w:r>
+        <w:rPr>
+          <w:color w:val="2C2C2A"/>
+        </w:rPr>
+        <w:t xml:space="preserve"> até um modelo preditivo simples e um sistema de recomendação com similaridade de cosseno.</w:t>
       </w:r>
     </w:p>
     <w:p>
@@ -1077,7 +1240,35 @@
         <w:rPr>
           <w:color w:val="2C2C2A"/>
         </w:rPr>
-        <w:t>Uma análise exploratória inicial na tabela orders, usando DuckDB para consultar o CSV diretamente (sem necessidade de carregar em banco ainda), cobrindo volume, distribuição de valores e qualidade dos dados.</w:t>
+        <w:t xml:space="preserve">Uma análise exploratória inicial na tabela </w:t>
+      </w:r>
+      <w:proofErr w:type="spellStart"/>
+      <w:r>
+        <w:rPr>
+          <w:color w:val="2C2C2A"/>
+        </w:rPr>
+        <w:t>orders</w:t>
+      </w:r>
+      <w:proofErr w:type="spellEnd"/>
+      <w:r>
+        <w:rPr>
+          <w:color w:val="2C2C2A"/>
+        </w:rPr>
+        <w:t xml:space="preserve">, usando </w:t>
+      </w:r>
+      <w:proofErr w:type="spellStart"/>
+      <w:r>
+        <w:rPr>
+          <w:color w:val="2C2C2A"/>
+        </w:rPr>
+        <w:t>DuckDB</w:t>
+      </w:r>
+      <w:proofErr w:type="spellEnd"/>
+      <w:r>
+        <w:rPr>
+          <w:color w:val="2C2C2A"/>
+        </w:rPr>
+        <w:t xml:space="preserve"> para consultar o CSV diretamente (sem necessidade de carregar em banco ainda), cobrindo volume, distribuição de valores e qualidade dos dados.</w:t>
       </w:r>
     </w:p>
     <w:p>
@@ -1118,12 +1309,6 @@
         <w:gridCol w:w="3800"/>
       </w:tblGrid>
       <w:tr>
-        <w:tblPrEx>
-          <w:tblCellMar>
-            <w:top w:w="0" w:type="dxa"/>
-            <w:bottom w:w="0" w:type="dxa"/>
-          </w:tblCellMar>
-        </w:tblPrEx>
         <w:trPr>
           <w:tblHeader/>
         </w:trPr>
@@ -1182,12 +1367,6 @@
         </w:tc>
       </w:tr>
       <w:tr>
-        <w:tblPrEx>
-          <w:tblCellMar>
-            <w:top w:w="0" w:type="dxa"/>
-            <w:bottom w:w="0" w:type="dxa"/>
-          </w:tblCellMar>
-        </w:tblPrEx>
         <w:tc>
           <w:tcPr>
             <w:tcW w:w="5200" w:type="dxa"/>
@@ -1237,12 +1416,6 @@
         </w:tc>
       </w:tr>
       <w:tr>
-        <w:tblPrEx>
-          <w:tblCellMar>
-            <w:top w:w="0" w:type="dxa"/>
-            <w:bottom w:w="0" w:type="dxa"/>
-          </w:tblCellMar>
-        </w:tblPrEx>
         <w:tc>
           <w:tcPr>
             <w:tcW w:w="5200" w:type="dxa"/>
@@ -1294,12 +1467,6 @@
         </w:tc>
       </w:tr>
       <w:tr>
-        <w:tblPrEx>
-          <w:tblCellMar>
-            <w:top w:w="0" w:type="dxa"/>
-            <w:bottom w:w="0" w:type="dxa"/>
-          </w:tblCellMar>
-        </w:tblPrEx>
         <w:tc>
           <w:tcPr>
             <w:tcW w:w="5200" w:type="dxa"/>
@@ -1318,7 +1485,25 @@
                 <w:sz w:val="20"/>
                 <w:szCs w:val="20"/>
               </w:rPr>
-              <w:t>Período (created_at)</w:t>
+              <w:t>Período (</w:t>
+            </w:r>
+            <w:proofErr w:type="spellStart"/>
+            <w:r>
+              <w:rPr>
+                <w:color w:val="2C2C2A"/>
+                <w:sz w:val="20"/>
+                <w:szCs w:val="20"/>
+              </w:rPr>
+              <w:t>created_at</w:t>
+            </w:r>
+            <w:proofErr w:type="spellEnd"/>
+            <w:r>
+              <w:rPr>
+                <w:color w:val="2C2C2A"/>
+                <w:sz w:val="20"/>
+                <w:szCs w:val="20"/>
+              </w:rPr>
+              <w:t>)</w:t>
             </w:r>
           </w:p>
         </w:tc>
@@ -1349,12 +1534,6 @@
         </w:tc>
       </w:tr>
       <w:tr>
-        <w:tblPrEx>
-          <w:tblCellMar>
-            <w:top w:w="0" w:type="dxa"/>
-            <w:bottom w:w="0" w:type="dxa"/>
-          </w:tblCellMar>
-        </w:tblPrEx>
         <w:tc>
           <w:tcPr>
             <w:tcW w:w="5200" w:type="dxa"/>
@@ -1406,12 +1585,6 @@
         </w:tc>
       </w:tr>
       <w:tr>
-        <w:tblPrEx>
-          <w:tblCellMar>
-            <w:top w:w="0" w:type="dxa"/>
-            <w:bottom w:w="0" w:type="dxa"/>
-          </w:tblCellMar>
-        </w:tblPrEx>
         <w:tc>
           <w:tcPr>
             <w:tcW w:w="5200" w:type="dxa"/>
@@ -1461,12 +1634,6 @@
         </w:tc>
       </w:tr>
       <w:tr>
-        <w:tblPrEx>
-          <w:tblCellMar>
-            <w:top w:w="0" w:type="dxa"/>
-            <w:bottom w:w="0" w:type="dxa"/>
-          </w:tblCellMar>
-        </w:tblPrEx>
         <w:tc>
           <w:tcPr>
             <w:tcW w:w="5200" w:type="dxa"/>
@@ -1518,12 +1685,6 @@
         </w:tc>
       </w:tr>
       <w:tr>
-        <w:tblPrEx>
-          <w:tblCellMar>
-            <w:top w:w="0" w:type="dxa"/>
-            <w:bottom w:w="0" w:type="dxa"/>
-          </w:tblCellMar>
-        </w:tblPrEx>
         <w:tc>
           <w:tcPr>
             <w:tcW w:w="5200" w:type="dxa"/>
@@ -1542,8 +1703,18 @@
                 <w:sz w:val="20"/>
                 <w:szCs w:val="20"/>
               </w:rPr>
-              <w:t>Nulos em total / created_at</w:t>
-            </w:r>
+              <w:t xml:space="preserve">Nulos em total / </w:t>
+            </w:r>
+            <w:proofErr w:type="spellStart"/>
+            <w:r>
+              <w:rPr>
+                <w:color w:val="2C2C2A"/>
+                <w:sz w:val="20"/>
+                <w:szCs w:val="20"/>
+              </w:rPr>
+              <w:t>created_at</w:t>
+            </w:r>
+            <w:proofErr w:type="spellEnd"/>
           </w:p>
         </w:tc>
         <w:tc>
@@ -1573,12 +1744,6 @@
         </w:tc>
       </w:tr>
       <w:tr>
-        <w:tblPrEx>
-          <w:tblCellMar>
-            <w:top w:w="0" w:type="dxa"/>
-            <w:bottom w:w="0" w:type="dxa"/>
-          </w:tblCellMar>
-        </w:tblPrEx>
         <w:tc>
           <w:tcPr>
             <w:tcW w:w="5200" w:type="dxa"/>
@@ -1643,8 +1808,20 @@
           <w:sz w:val="20"/>
           <w:szCs w:val="20"/>
         </w:rPr>
-        <w:t>Tabela 2 — Visão geral da tabela orders</w:t>
-      </w:r>
+        <w:t xml:space="preserve">Tabela 2 — Visão geral da tabela </w:t>
+      </w:r>
+      <w:proofErr w:type="spellStart"/>
+      <w:r>
+        <w:rPr>
+          <w:i/>
+          <w:iCs/>
+          <w:color w:val="5F5E5A"/>
+          <w:sz w:val="20"/>
+          <w:szCs w:val="20"/>
+        </w:rPr>
+        <w:t>orders</w:t>
+      </w:r>
+      <w:proofErr w:type="spellEnd"/>
     </w:p>
     <w:p>
       <w:pPr>
@@ -1735,8 +1912,18 @@
           <w:bCs/>
           <w:color w:val="26215C"/>
         </w:rPr>
-        <w:t>Frente 2 — Tratamento de Dados: Modelagem de Schema</w:t>
-      </w:r>
+        <w:t xml:space="preserve">Frente 2 — Tratamento de Dados: Modelagem de </w:t>
+      </w:r>
+      <w:proofErr w:type="spellStart"/>
+      <w:r>
+        <w:rPr>
+          <w:b/>
+          <w:bCs/>
+          <w:color w:val="26215C"/>
+        </w:rPr>
+        <w:t>Schema</w:t>
+      </w:r>
+      <w:proofErr w:type="spellEnd"/>
     </w:p>
     <w:p>
       <w:pPr>
@@ -1776,7 +1963,35 @@
         <w:rPr>
           <w:color w:val="2C2C2A"/>
         </w:rPr>
-        <w:t>Como o ERP não permite conexão direta ao banco, os dados só existem como CSVs. Era preciso definir a estrutura (schema) de um banco PostgreSQL para receber esses dados.</w:t>
+        <w:t xml:space="preserve">Como o ERP não permite conexão direta ao banco, os dados só existem como </w:t>
+      </w:r>
+      <w:proofErr w:type="spellStart"/>
+      <w:r>
+        <w:rPr>
+          <w:color w:val="2C2C2A"/>
+        </w:rPr>
+        <w:t>CSVs</w:t>
+      </w:r>
+      <w:proofErr w:type="spellEnd"/>
+      <w:r>
+        <w:rPr>
+          <w:color w:val="2C2C2A"/>
+        </w:rPr>
+        <w:t>. Era preciso definir a estrutura (</w:t>
+      </w:r>
+      <w:proofErr w:type="spellStart"/>
+      <w:r>
+        <w:rPr>
+          <w:color w:val="2C2C2A"/>
+        </w:rPr>
+        <w:t>schema</w:t>
+      </w:r>
+      <w:proofErr w:type="spellEnd"/>
+      <w:r>
+        <w:rPr>
+          <w:color w:val="2C2C2A"/>
+        </w:rPr>
+        <w:t>) de um banco PostgreSQL para receber esses dados.</w:t>
       </w:r>
     </w:p>
     <w:p>
@@ -1802,7 +2017,91 @@
         <w:rPr>
           <w:color w:val="2C2C2A"/>
         </w:rPr>
-        <w:t>Um script em Python puro (apenas bibliotecas nativas: csv, os, re, glob, datetime) lê todos os CSVs de um diretório, infere o tipo de dado PostgreSQL mais adequado para cada coluna, e gera um único arquivo schema.sql com os CREATE TABLE correspondentes.</w:t>
+        <w:t xml:space="preserve">Um script em Python puro (apenas bibliotecas nativas: </w:t>
+      </w:r>
+      <w:proofErr w:type="spellStart"/>
+      <w:r>
+        <w:rPr>
+          <w:color w:val="2C2C2A"/>
+        </w:rPr>
+        <w:t>csv</w:t>
+      </w:r>
+      <w:proofErr w:type="spellEnd"/>
+      <w:r>
+        <w:rPr>
+          <w:color w:val="2C2C2A"/>
+        </w:rPr>
+        <w:t xml:space="preserve">, os, </w:t>
+      </w:r>
+      <w:proofErr w:type="spellStart"/>
+      <w:r>
+        <w:rPr>
+          <w:color w:val="2C2C2A"/>
+        </w:rPr>
+        <w:t>re</w:t>
+      </w:r>
+      <w:proofErr w:type="spellEnd"/>
+      <w:r>
+        <w:rPr>
+          <w:color w:val="2C2C2A"/>
+        </w:rPr>
+        <w:t xml:space="preserve">, </w:t>
+      </w:r>
+      <w:proofErr w:type="spellStart"/>
+      <w:r>
+        <w:rPr>
+          <w:color w:val="2C2C2A"/>
+        </w:rPr>
+        <w:t>glob</w:t>
+      </w:r>
+      <w:proofErr w:type="spellEnd"/>
+      <w:r>
+        <w:rPr>
+          <w:color w:val="2C2C2A"/>
+        </w:rPr>
+        <w:t xml:space="preserve">, </w:t>
+      </w:r>
+      <w:proofErr w:type="spellStart"/>
+      <w:r>
+        <w:rPr>
+          <w:color w:val="2C2C2A"/>
+        </w:rPr>
+        <w:t>datetime</w:t>
+      </w:r>
+      <w:proofErr w:type="spellEnd"/>
+      <w:r>
+        <w:rPr>
+          <w:color w:val="2C2C2A"/>
+        </w:rPr>
+        <w:t xml:space="preserve">) lê todos os </w:t>
+      </w:r>
+      <w:proofErr w:type="spellStart"/>
+      <w:r>
+        <w:rPr>
+          <w:color w:val="2C2C2A"/>
+        </w:rPr>
+        <w:t>CSVs</w:t>
+      </w:r>
+      <w:proofErr w:type="spellEnd"/>
+      <w:r>
+        <w:rPr>
+          <w:color w:val="2C2C2A"/>
+        </w:rPr>
+        <w:t xml:space="preserve"> de um diretório, infere o tipo de dado PostgreSQL mais adequado para cada coluna, e gera um único arquivo </w:t>
+      </w:r>
+      <w:proofErr w:type="spellStart"/>
+      <w:r>
+        <w:rPr>
+          <w:color w:val="2C2C2A"/>
+        </w:rPr>
+        <w:t>schema.sql</w:t>
+      </w:r>
+      <w:proofErr w:type="spellEnd"/>
+      <w:r>
+        <w:rPr>
+          <w:color w:val="2C2C2A"/>
+        </w:rPr>
+        <w:t xml:space="preserve"> com os CREATE TABLE correspondentes.</w:t>
       </w:r>
     </w:p>
     <w:p>
@@ -1834,7 +2133,63 @@
         <w:rPr>
           <w:color w:val="2C2C2A"/>
         </w:rPr>
-        <w:t>Identificadores como texto, não número: colunas como cpf, phone, tax_id e barcode_ean foram tratadas como VARCHAR, não BIGINT — evitando perda de zeros à esquerda e refletindo que esses campos nunca são usados em cálculo.</w:t>
+        <w:t xml:space="preserve">Identificadores como texto, não número: colunas como </w:t>
+      </w:r>
+      <w:proofErr w:type="spellStart"/>
+      <w:r>
+        <w:rPr>
+          <w:color w:val="2C2C2A"/>
+        </w:rPr>
+        <w:t>cpf</w:t>
+      </w:r>
+      <w:proofErr w:type="spellEnd"/>
+      <w:r>
+        <w:rPr>
+          <w:color w:val="2C2C2A"/>
+        </w:rPr>
+        <w:t xml:space="preserve">, </w:t>
+      </w:r>
+      <w:proofErr w:type="spellStart"/>
+      <w:r>
+        <w:rPr>
+          <w:color w:val="2C2C2A"/>
+        </w:rPr>
+        <w:t>phone</w:t>
+      </w:r>
+      <w:proofErr w:type="spellEnd"/>
+      <w:r>
+        <w:rPr>
+          <w:color w:val="2C2C2A"/>
+        </w:rPr>
+        <w:t xml:space="preserve">, </w:t>
+      </w:r>
+      <w:proofErr w:type="spellStart"/>
+      <w:r>
+        <w:rPr>
+          <w:color w:val="2C2C2A"/>
+        </w:rPr>
+        <w:t>tax_id</w:t>
+      </w:r>
+      <w:proofErr w:type="spellEnd"/>
+      <w:r>
+        <w:rPr>
+          <w:color w:val="2C2C2A"/>
+        </w:rPr>
+        <w:t xml:space="preserve"> e </w:t>
+      </w:r>
+      <w:proofErr w:type="spellStart"/>
+      <w:r>
+        <w:rPr>
+          <w:color w:val="2C2C2A"/>
+        </w:rPr>
+        <w:t>barcode_ean</w:t>
+      </w:r>
+      <w:proofErr w:type="spellEnd"/>
+      <w:r>
+        <w:rPr>
+          <w:color w:val="2C2C2A"/>
+        </w:rPr>
+        <w:t xml:space="preserve"> foram tratadas como VARCHAR, não BIGINT — evitando perda de zeros à esquerda e refletindo que esses campos nunca são usados em cálculo.</w:t>
       </w:r>
     </w:p>
     <w:p>
@@ -1846,11 +2201,33 @@
         </w:numPr>
         <w:spacing w:after="80"/>
       </w:pPr>
-      <w:r>
-        <w:rPr>
-          <w:color w:val="2C2C2A"/>
-        </w:rPr>
-        <w:t>Boolean priorizado sobre inteiro: a ordem de verificação de tipo garante que colunas binárias (0/1, true/false) sejam corretamente identificadas como BOOLEAN, não INTEGER.</w:t>
+      <w:proofErr w:type="spellStart"/>
+      <w:r>
+        <w:rPr>
+          <w:color w:val="2C2C2A"/>
+        </w:rPr>
+        <w:t>Boolean</w:t>
+      </w:r>
+      <w:proofErr w:type="spellEnd"/>
+      <w:r>
+        <w:rPr>
+          <w:color w:val="2C2C2A"/>
+        </w:rPr>
+        <w:t xml:space="preserve"> priorizado sobre inteiro: a ordem de verificação de tipo garante que colunas binárias (0/1, </w:t>
+      </w:r>
+      <w:proofErr w:type="spellStart"/>
+      <w:r>
+        <w:rPr>
+          <w:color w:val="2C2C2A"/>
+        </w:rPr>
+        <w:t>true</w:t>
+      </w:r>
+      <w:proofErr w:type="spellEnd"/>
+      <w:r>
+        <w:rPr>
+          <w:color w:val="2C2C2A"/>
+        </w:rPr>
+        <w:t>/false) sejam corretamente identificadas como BOOLEAN, não INTEGER.</w:t>
       </w:r>
     </w:p>
     <w:p>
@@ -1892,7 +2269,21 @@
         <w:rPr>
           <w:color w:val="2C2C2A"/>
         </w:rPr>
-        <w:t>O schema.sql gerado foi executado de fato contra um PostgreSQL 16 real (container Docker), não apenas gerado teoricamente. Resultado: 24 tabelas criadas com sucesso, sem nenhum erro de sintaxe.</w:t>
+        <w:t xml:space="preserve">O </w:t>
+      </w:r>
+      <w:proofErr w:type="spellStart"/>
+      <w:r>
+        <w:rPr>
+          <w:color w:val="2C2C2A"/>
+        </w:rPr>
+        <w:t>schema.sql</w:t>
+      </w:r>
+      <w:proofErr w:type="spellEnd"/>
+      <w:r>
+        <w:rPr>
+          <w:color w:val="2C2C2A"/>
+        </w:rPr>
+        <w:t xml:space="preserve"> gerado foi executado de fato contra um PostgreSQL 16 real (container Docker), não apenas gerado teoricamente. Resultado: 24 tabelas criadas com sucesso, sem nenhum erro de sintaxe.</w:t>
       </w:r>
     </w:p>
     <w:p>
@@ -1948,7 +2339,35 @@
         <w:rPr>
           <w:color w:val="2C2C2A"/>
         </w:rPr>
-        <w:t>Com o schema criado, era necessário carregar os dados reais dos CSVs no banco, sem nenhum tratamento (sem remoção de nulos, sem correção de caracteres) — carga bruta, fiel à origem.</w:t>
+        <w:t xml:space="preserve">Com o </w:t>
+      </w:r>
+      <w:proofErr w:type="spellStart"/>
+      <w:r>
+        <w:rPr>
+          <w:color w:val="2C2C2A"/>
+        </w:rPr>
+        <w:t>schema</w:t>
+      </w:r>
+      <w:proofErr w:type="spellEnd"/>
+      <w:r>
+        <w:rPr>
+          <w:color w:val="2C2C2A"/>
+        </w:rPr>
+        <w:t xml:space="preserve"> criado, era necessário carregar os dados reais dos </w:t>
+      </w:r>
+      <w:proofErr w:type="spellStart"/>
+      <w:r>
+        <w:rPr>
+          <w:color w:val="2C2C2A"/>
+        </w:rPr>
+        <w:t>CSVs</w:t>
+      </w:r>
+      <w:proofErr w:type="spellEnd"/>
+      <w:r>
+        <w:rPr>
+          <w:color w:val="2C2C2A"/>
+        </w:rPr>
+        <w:t xml:space="preserve"> no banco, sem nenhum tratamento (sem remoção de nulos, sem correção de caracteres) — carga bruta, fiel à origem.</w:t>
       </w:r>
     </w:p>
     <w:p>
@@ -1974,7 +2393,21 @@
         <w:rPr>
           <w:color w:val="2C2C2A"/>
         </w:rPr>
-        <w:t>Um script Python usando psycopg2 e o comando COPY nativo do PostgreSQL — a forma mais rápida e menos invasiva de carregar CSVs em massa, já que o próprio banco interpreta os tipos a partir do texto, sem nenhuma lógica de conversão passando pela mão do Python.</w:t>
+        <w:t xml:space="preserve">Um script Python usando psycopg2 e o comando COPY nativo do PostgreSQL — a forma mais rápida e menos invasiva de carregar </w:t>
+      </w:r>
+      <w:proofErr w:type="spellStart"/>
+      <w:r>
+        <w:rPr>
+          <w:color w:val="2C2C2A"/>
+        </w:rPr>
+        <w:t>CSVs</w:t>
+      </w:r>
+      <w:proofErr w:type="spellEnd"/>
+      <w:r>
+        <w:rPr>
+          <w:color w:val="2C2C2A"/>
+        </w:rPr>
+        <w:t xml:space="preserve"> em massa, já que o próprio banco interpreta os tipos a partir do texto, sem nenhuma lógica de conversão passando pela mão do Python.</w:t>
       </w:r>
     </w:p>
     <w:p>
@@ -2000,7 +2433,35 @@
         <w:rPr>
           <w:color w:val="2C2C2A"/>
         </w:rPr>
-        <w:t>Todos os 24 arquivos CSV foram carregados com sucesso, totalizando volumes que variam de 6 linhas (locations) a 147.320 linhas (order_items).</w:t>
+        <w:t>Todos os 24 arquivos CSV foram carregados com sucesso, totalizando volumes que variam de 6 linhas (</w:t>
+      </w:r>
+      <w:proofErr w:type="spellStart"/>
+      <w:r>
+        <w:rPr>
+          <w:color w:val="2C2C2A"/>
+        </w:rPr>
+        <w:t>locations</w:t>
+      </w:r>
+      <w:proofErr w:type="spellEnd"/>
+      <w:r>
+        <w:rPr>
+          <w:color w:val="2C2C2A"/>
+        </w:rPr>
+        <w:t>) a 147.320 linhas (</w:t>
+      </w:r>
+      <w:proofErr w:type="spellStart"/>
+      <w:r>
+        <w:rPr>
+          <w:color w:val="2C2C2A"/>
+        </w:rPr>
+        <w:t>order_items</w:t>
+      </w:r>
+      <w:proofErr w:type="spellEnd"/>
+      <w:r>
+        <w:rPr>
+          <w:color w:val="2C2C2A"/>
+        </w:rPr>
+        <w:t>).</w:t>
       </w:r>
     </w:p>
     <w:p>
@@ -2034,7 +2495,63 @@
         <w:rPr>
           <w:color w:val="2C2C2A"/>
         </w:rPr>
-        <w:t>soma total de linhas entre customers, orders, order_items e payments?</w:t>
+        <w:t xml:space="preserve">soma total de linhas entre </w:t>
+      </w:r>
+      <w:proofErr w:type="spellStart"/>
+      <w:r>
+        <w:rPr>
+          <w:color w:val="2C2C2A"/>
+        </w:rPr>
+        <w:t>customers</w:t>
+      </w:r>
+      <w:proofErr w:type="spellEnd"/>
+      <w:r>
+        <w:rPr>
+          <w:color w:val="2C2C2A"/>
+        </w:rPr>
+        <w:t xml:space="preserve">, </w:t>
+      </w:r>
+      <w:proofErr w:type="spellStart"/>
+      <w:r>
+        <w:rPr>
+          <w:color w:val="2C2C2A"/>
+        </w:rPr>
+        <w:t>orders</w:t>
+      </w:r>
+      <w:proofErr w:type="spellEnd"/>
+      <w:r>
+        <w:rPr>
+          <w:color w:val="2C2C2A"/>
+        </w:rPr>
+        <w:t xml:space="preserve">, </w:t>
+      </w:r>
+      <w:proofErr w:type="spellStart"/>
+      <w:r>
+        <w:rPr>
+          <w:color w:val="2C2C2A"/>
+        </w:rPr>
+        <w:t>order_items</w:t>
+      </w:r>
+      <w:proofErr w:type="spellEnd"/>
+      <w:r>
+        <w:rPr>
+          <w:color w:val="2C2C2A"/>
+        </w:rPr>
+        <w:t xml:space="preserve"> e </w:t>
+      </w:r>
+      <w:proofErr w:type="spellStart"/>
+      <w:r>
+        <w:rPr>
+          <w:color w:val="2C2C2A"/>
+        </w:rPr>
+        <w:t>payments</w:t>
+      </w:r>
+      <w:proofErr w:type="spellEnd"/>
+      <w:r>
+        <w:rPr>
+          <w:color w:val="2C2C2A"/>
+        </w:rPr>
+        <w:t>?</w:t>
       </w:r>
     </w:p>
     <w:tbl>
@@ -2059,12 +2576,6 @@
         <w:gridCol w:w="3800"/>
       </w:tblGrid>
       <w:tr>
-        <w:tblPrEx>
-          <w:tblCellMar>
-            <w:top w:w="0" w:type="dxa"/>
-            <w:bottom w:w="0" w:type="dxa"/>
-          </w:tblCellMar>
-        </w:tblPrEx>
         <w:trPr>
           <w:tblHeader/>
         </w:trPr>
@@ -2123,12 +2634,6 @@
         </w:tc>
       </w:tr>
       <w:tr>
-        <w:tblPrEx>
-          <w:tblCellMar>
-            <w:top w:w="0" w:type="dxa"/>
-            <w:bottom w:w="0" w:type="dxa"/>
-          </w:tblCellMar>
-        </w:tblPrEx>
         <w:tc>
           <w:tcPr>
             <w:tcW w:w="5200" w:type="dxa"/>
@@ -2141,6 +2646,7 @@
             <w:vAlign w:val="center"/>
           </w:tcPr>
           <w:p>
+            <w:proofErr w:type="spellStart"/>
             <w:r>
               <w:rPr>
                 <w:color w:val="2C2C2A"/>
@@ -2149,6 +2655,7 @@
               </w:rPr>
               <w:t>customers</w:t>
             </w:r>
+            <w:proofErr w:type="spellEnd"/>
           </w:p>
         </w:tc>
         <w:tc>
@@ -2178,12 +2685,6 @@
         </w:tc>
       </w:tr>
       <w:tr>
-        <w:tblPrEx>
-          <w:tblCellMar>
-            <w:top w:w="0" w:type="dxa"/>
-            <w:bottom w:w="0" w:type="dxa"/>
-          </w:tblCellMar>
-        </w:tblPrEx>
         <w:tc>
           <w:tcPr>
             <w:tcW w:w="5200" w:type="dxa"/>
@@ -2197,6 +2698,7 @@
             <w:vAlign w:val="center"/>
           </w:tcPr>
           <w:p>
+            <w:proofErr w:type="spellStart"/>
             <w:r>
               <w:rPr>
                 <w:color w:val="2C2C2A"/>
@@ -2205,6 +2707,7 @@
               </w:rPr>
               <w:t>orders</w:t>
             </w:r>
+            <w:proofErr w:type="spellEnd"/>
           </w:p>
         </w:tc>
         <w:tc>
@@ -2235,12 +2738,6 @@
         </w:tc>
       </w:tr>
       <w:tr>
-        <w:tblPrEx>
-          <w:tblCellMar>
-            <w:top w:w="0" w:type="dxa"/>
-            <w:bottom w:w="0" w:type="dxa"/>
-          </w:tblCellMar>
-        </w:tblPrEx>
         <w:tc>
           <w:tcPr>
             <w:tcW w:w="5200" w:type="dxa"/>
@@ -2253,6 +2750,7 @@
             <w:vAlign w:val="center"/>
           </w:tcPr>
           <w:p>
+            <w:proofErr w:type="spellStart"/>
             <w:r>
               <w:rPr>
                 <w:color w:val="2C2C2A"/>
@@ -2261,6 +2759,7 @@
               </w:rPr>
               <w:t>order_items</w:t>
             </w:r>
+            <w:proofErr w:type="spellEnd"/>
           </w:p>
         </w:tc>
         <w:tc>
@@ -2290,12 +2789,6 @@
         </w:tc>
       </w:tr>
       <w:tr>
-        <w:tblPrEx>
-          <w:tblCellMar>
-            <w:top w:w="0" w:type="dxa"/>
-            <w:bottom w:w="0" w:type="dxa"/>
-          </w:tblCellMar>
-        </w:tblPrEx>
         <w:tc>
           <w:tcPr>
             <w:tcW w:w="5200" w:type="dxa"/>
@@ -2309,6 +2802,7 @@
             <w:vAlign w:val="center"/>
           </w:tcPr>
           <w:p>
+            <w:proofErr w:type="spellStart"/>
             <w:r>
               <w:rPr>
                 <w:color w:val="2C2C2A"/>
@@ -2317,6 +2811,7 @@
               </w:rPr>
               <w:t>payments</w:t>
             </w:r>
+            <w:proofErr w:type="spellEnd"/>
           </w:p>
         </w:tc>
         <w:tc>
@@ -2347,12 +2842,6 @@
         </w:tc>
       </w:tr>
       <w:tr>
-        <w:tblPrEx>
-          <w:tblCellMar>
-            <w:top w:w="0" w:type="dxa"/>
-            <w:bottom w:w="0" w:type="dxa"/>
-          </w:tblCellMar>
-        </w:tblPrEx>
         <w:tc>
           <w:tcPr>
             <w:tcW w:w="5200" w:type="dxa"/>
@@ -2483,7 +2972,21 @@
         <w:rPr>
           <w:color w:val="2C2C2A"/>
         </w:rPr>
-        <w:t>A Diretoria da LH Nautical deseja identificar os clientes fiéis: não quem compra muito uma única vez, mas quem tem gasto médio alto por transação e navega por diversas categorias da loja — para replicar esse comportamento em outros segmentos.</w:t>
+        <w:t xml:space="preserve">A Diretoria da LH </w:t>
+      </w:r>
+      <w:proofErr w:type="spellStart"/>
+      <w:r>
+        <w:rPr>
+          <w:color w:val="2C2C2A"/>
+        </w:rPr>
+        <w:t>Nautical</w:t>
+      </w:r>
+      <w:proofErr w:type="spellEnd"/>
+      <w:r>
+        <w:rPr>
+          <w:color w:val="2C2C2A"/>
+        </w:rPr>
+        <w:t xml:space="preserve"> deseja identificar os clientes fiéis: não quem compra muito uma única vez, mas quem tem gasto médio alto por transação e navega por diversas categorias da loja — para replicar esse comportamento em outros segmentos.</w:t>
       </w:r>
     </w:p>
     <w:p>
@@ -2509,7 +3012,133 @@
         <w:rPr>
           <w:color w:val="2C2C2A"/>
         </w:rPr>
-        <w:t>Uma análise SQL com CTEs (common table expressions) calculando, por cliente: Faturamento Total (soma de total em orders), Frequência (contagem de pedidos), Ticket Médio (Faturamento / Frequência) e Diversidade de Categorias (COUNT DISTINCT category_id, percorrendo orders → order_items → product_variants → products). Os clientes foram filtrados pelo critério de elite (diversidade ≥ 13 categorias) e ranqueados pelo maior Ticket Médio.</w:t>
+        <w:t xml:space="preserve">Uma análise SQL com </w:t>
+      </w:r>
+      <w:proofErr w:type="spellStart"/>
+      <w:r>
+        <w:rPr>
+          <w:color w:val="2C2C2A"/>
+        </w:rPr>
+        <w:t>CTEs</w:t>
+      </w:r>
+      <w:proofErr w:type="spellEnd"/>
+      <w:r>
+        <w:rPr>
+          <w:color w:val="2C2C2A"/>
+        </w:rPr>
+        <w:t xml:space="preserve"> (common </w:t>
+      </w:r>
+      <w:proofErr w:type="spellStart"/>
+      <w:r>
+        <w:rPr>
+          <w:color w:val="2C2C2A"/>
+        </w:rPr>
+        <w:t>table</w:t>
+      </w:r>
+      <w:proofErr w:type="spellEnd"/>
+      <w:r>
+        <w:rPr>
+          <w:color w:val="2C2C2A"/>
+        </w:rPr>
+        <w:t xml:space="preserve"> </w:t>
+      </w:r>
+      <w:proofErr w:type="spellStart"/>
+      <w:r>
+        <w:rPr>
+          <w:color w:val="2C2C2A"/>
+        </w:rPr>
+        <w:t>expressions</w:t>
+      </w:r>
+      <w:proofErr w:type="spellEnd"/>
+      <w:r>
+        <w:rPr>
+          <w:color w:val="2C2C2A"/>
+        </w:rPr>
+        <w:t xml:space="preserve">) calculando, por cliente: Faturamento Total (soma de total em </w:t>
+      </w:r>
+      <w:proofErr w:type="spellStart"/>
+      <w:r>
+        <w:rPr>
+          <w:color w:val="2C2C2A"/>
+        </w:rPr>
+        <w:t>orders</w:t>
+      </w:r>
+      <w:proofErr w:type="spellEnd"/>
+      <w:r>
+        <w:rPr>
+          <w:color w:val="2C2C2A"/>
+        </w:rPr>
+        <w:t xml:space="preserve">), Frequência (contagem de pedidos), Ticket Médio (Faturamento / Frequência) e Diversidade de Categorias (COUNT DISTINCT </w:t>
+      </w:r>
+      <w:proofErr w:type="spellStart"/>
+      <w:r>
+        <w:rPr>
+          <w:color w:val="2C2C2A"/>
+        </w:rPr>
+        <w:t>category_id</w:t>
+      </w:r>
+      <w:proofErr w:type="spellEnd"/>
+      <w:r>
+        <w:rPr>
+          <w:color w:val="2C2C2A"/>
+        </w:rPr>
+        <w:t xml:space="preserve">, percorrendo </w:t>
+      </w:r>
+      <w:proofErr w:type="spellStart"/>
+      <w:r>
+        <w:rPr>
+          <w:color w:val="2C2C2A"/>
+        </w:rPr>
+        <w:t>orders</w:t>
+      </w:r>
+      <w:proofErr w:type="spellEnd"/>
+      <w:r>
+        <w:rPr>
+          <w:color w:val="2C2C2A"/>
+        </w:rPr>
+        <w:t xml:space="preserve"> → </w:t>
+      </w:r>
+      <w:proofErr w:type="spellStart"/>
+      <w:r>
+        <w:rPr>
+          <w:color w:val="2C2C2A"/>
+        </w:rPr>
+        <w:t>order_items</w:t>
+      </w:r>
+      <w:proofErr w:type="spellEnd"/>
+      <w:r>
+        <w:rPr>
+          <w:color w:val="2C2C2A"/>
+        </w:rPr>
+        <w:t xml:space="preserve"> → </w:t>
+      </w:r>
+      <w:proofErr w:type="spellStart"/>
+      <w:r>
+        <w:rPr>
+          <w:color w:val="2C2C2A"/>
+        </w:rPr>
+        <w:t>product_variants</w:t>
+      </w:r>
+      <w:proofErr w:type="spellEnd"/>
+      <w:r>
+        <w:rPr>
+          <w:color w:val="2C2C2A"/>
+        </w:rPr>
+        <w:t xml:space="preserve"> → </w:t>
+      </w:r>
+      <w:proofErr w:type="spellStart"/>
+      <w:r>
+        <w:rPr>
+          <w:color w:val="2C2C2A"/>
+        </w:rPr>
+        <w:t>products</w:t>
+      </w:r>
+      <w:proofErr w:type="spellEnd"/>
+      <w:r>
+        <w:rPr>
+          <w:color w:val="2C2C2A"/>
+        </w:rPr>
+        <w:t>). Os clientes foram filtrados pelo critério de elite (diversidade ≥ 13 categorias) e ranqueados pelo maior Ticket Médio.</w:t>
       </w:r>
     </w:p>
     <w:p>
@@ -2552,12 +3181,6 @@
         <w:gridCol w:w="1400"/>
       </w:tblGrid>
       <w:tr>
-        <w:tblPrEx>
-          <w:tblCellMar>
-            <w:top w:w="0" w:type="dxa"/>
-            <w:bottom w:w="0" w:type="dxa"/>
-          </w:tblCellMar>
-        </w:tblPrEx>
         <w:trPr>
           <w:tblHeader/>
         </w:trPr>
@@ -2574,6 +3197,7 @@
             <w:vAlign w:val="center"/>
           </w:tcPr>
           <w:p>
+            <w:proofErr w:type="spellStart"/>
             <w:r>
               <w:rPr>
                 <w:b/>
@@ -2584,6 +3208,7 @@
               </w:rPr>
               <w:t>customer_id</w:t>
             </w:r>
+            <w:proofErr w:type="spellEnd"/>
           </w:p>
         </w:tc>
         <w:tc>
@@ -2700,12 +3325,6 @@
         </w:tc>
       </w:tr>
       <w:tr>
-        <w:tblPrEx>
-          <w:tblCellMar>
-            <w:top w:w="0" w:type="dxa"/>
-            <w:bottom w:w="0" w:type="dxa"/>
-          </w:tblCellMar>
-        </w:tblPrEx>
         <w:tc>
           <w:tcPr>
             <w:tcW w:w="1600" w:type="dxa"/>
@@ -2830,12 +3449,6 @@
         </w:tc>
       </w:tr>
       <w:tr>
-        <w:tblPrEx>
-          <w:tblCellMar>
-            <w:top w:w="0" w:type="dxa"/>
-            <w:bottom w:w="0" w:type="dxa"/>
-          </w:tblCellMar>
-        </w:tblPrEx>
         <w:tc>
           <w:tcPr>
             <w:tcW w:w="1600" w:type="dxa"/>
@@ -2965,12 +3578,6 @@
         </w:tc>
       </w:tr>
       <w:tr>
-        <w:tblPrEx>
-          <w:tblCellMar>
-            <w:top w:w="0" w:type="dxa"/>
-            <w:bottom w:w="0" w:type="dxa"/>
-          </w:tblCellMar>
-        </w:tblPrEx>
         <w:tc>
           <w:tcPr>
             <w:tcW w:w="1600" w:type="dxa"/>
@@ -3095,12 +3702,6 @@
         </w:tc>
       </w:tr>
       <w:tr>
-        <w:tblPrEx>
-          <w:tblCellMar>
-            <w:top w:w="0" w:type="dxa"/>
-            <w:bottom w:w="0" w:type="dxa"/>
-          </w:tblCellMar>
-        </w:tblPrEx>
         <w:tc>
           <w:tcPr>
             <w:tcW w:w="1600" w:type="dxa"/>
@@ -3230,12 +3831,6 @@
         </w:tc>
       </w:tr>
       <w:tr>
-        <w:tblPrEx>
-          <w:tblCellMar>
-            <w:top w:w="0" w:type="dxa"/>
-            <w:bottom w:w="0" w:type="dxa"/>
-          </w:tblCellMar>
-        </w:tblPrEx>
         <w:tc>
           <w:tcPr>
             <w:tcW w:w="1600" w:type="dxa"/>
@@ -3360,12 +3955,6 @@
         </w:tc>
       </w:tr>
       <w:tr>
-        <w:tblPrEx>
-          <w:tblCellMar>
-            <w:top w:w="0" w:type="dxa"/>
-            <w:bottom w:w="0" w:type="dxa"/>
-          </w:tblCellMar>
-        </w:tblPrEx>
         <w:tc>
           <w:tcPr>
             <w:tcW w:w="1600" w:type="dxa"/>
@@ -3495,12 +4084,6 @@
         </w:tc>
       </w:tr>
       <w:tr>
-        <w:tblPrEx>
-          <w:tblCellMar>
-            <w:top w:w="0" w:type="dxa"/>
-            <w:bottom w:w="0" w:type="dxa"/>
-          </w:tblCellMar>
-        </w:tblPrEx>
         <w:tc>
           <w:tcPr>
             <w:tcW w:w="1600" w:type="dxa"/>
@@ -3625,12 +4208,6 @@
         </w:tc>
       </w:tr>
       <w:tr>
-        <w:tblPrEx>
-          <w:tblCellMar>
-            <w:top w:w="0" w:type="dxa"/>
-            <w:bottom w:w="0" w:type="dxa"/>
-          </w:tblCellMar>
-        </w:tblPrEx>
         <w:tc>
           <w:tcPr>
             <w:tcW w:w="1600" w:type="dxa"/>
@@ -3760,12 +4337,6 @@
         </w:tc>
       </w:tr>
       <w:tr>
-        <w:tblPrEx>
-          <w:tblCellMar>
-            <w:top w:w="0" w:type="dxa"/>
-            <w:bottom w:w="0" w:type="dxa"/>
-          </w:tblCellMar>
-        </w:tblPrEx>
         <w:tc>
           <w:tcPr>
             <w:tcW w:w="1600" w:type="dxa"/>
@@ -3890,12 +4461,6 @@
         </w:tc>
       </w:tr>
       <w:tr>
-        <w:tblPrEx>
-          <w:tblCellMar>
-            <w:top w:w="0" w:type="dxa"/>
-            <w:bottom w:w="0" w:type="dxa"/>
-          </w:tblCellMar>
-        </w:tblPrEx>
         <w:tc>
           <w:tcPr>
             <w:tcW w:w="1600" w:type="dxa"/>
@@ -4152,7 +4717,29 @@
         <w:rPr>
           <w:color w:val="2C2C2A"/>
         </w:rPr>
-        <w:t>Entre os itens comprados por esses 10 clientes, a categoria que concentra a maior quantidade total de itens (SUM(quantity)) é:</w:t>
+        <w:t>Entre os itens comprados por esses 10 clientes, a categoria que concentra a maior quantidade total de itens (</w:t>
+      </w:r>
+      <w:proofErr w:type="gramStart"/>
+      <w:r>
+        <w:rPr>
+          <w:color w:val="2C2C2A"/>
+        </w:rPr>
+        <w:t>SUM(</w:t>
+      </w:r>
+      <w:proofErr w:type="spellStart"/>
+      <w:proofErr w:type="gramEnd"/>
+      <w:r>
+        <w:rPr>
+          <w:color w:val="2C2C2A"/>
+        </w:rPr>
+        <w:t>quantity</w:t>
+      </w:r>
+      <w:proofErr w:type="spellEnd"/>
+      <w:r>
+        <w:rPr>
+          <w:color w:val="2C2C2A"/>
+        </w:rPr>
+        <w:t>)) é:</w:t>
       </w:r>
     </w:p>
     <w:tbl>
@@ -4177,12 +4764,6 @@
         <w:gridCol w:w="3800"/>
       </w:tblGrid>
       <w:tr>
-        <w:tblPrEx>
-          <w:tblCellMar>
-            <w:top w:w="0" w:type="dxa"/>
-            <w:bottom w:w="0" w:type="dxa"/>
-          </w:tblCellMar>
-        </w:tblPrEx>
         <w:trPr>
           <w:tblHeader/>
         </w:trPr>
@@ -4241,12 +4822,6 @@
         </w:tc>
       </w:tr>
       <w:tr>
-        <w:tblPrEx>
-          <w:tblCellMar>
-            <w:top w:w="0" w:type="dxa"/>
-            <w:bottom w:w="0" w:type="dxa"/>
-          </w:tblCellMar>
-        </w:tblPrEx>
         <w:tc>
           <w:tcPr>
             <w:tcW w:w="5200" w:type="dxa"/>
@@ -4328,7 +4903,21 @@
         <w:rPr>
           <w:color w:val="2C2C2A"/>
         </w:rPr>
-        <w:t>Hélices é a categoria com maior concentração de compra entre o grupo de elite — uma pista concreta de onde focar esforços de retenção e cross-sell direcionados a esse perfil de cliente.</w:t>
+        <w:t xml:space="preserve">Hélices é a categoria com maior concentração de compra entre o grupo de elite — uma pista concreta de onde focar esforços de retenção e </w:t>
+      </w:r>
+      <w:proofErr w:type="spellStart"/>
+      <w:r>
+        <w:rPr>
+          <w:color w:val="2C2C2A"/>
+        </w:rPr>
+        <w:t>cross-sell</w:t>
+      </w:r>
+      <w:proofErr w:type="spellEnd"/>
+      <w:r>
+        <w:rPr>
+          <w:color w:val="2C2C2A"/>
+        </w:rPr>
+        <w:t xml:space="preserve"> direcionados a esse perfil de cliente.</w:t>
       </w:r>
     </w:p>
     <w:p>
@@ -4425,7 +5014,49 @@
         <w:rPr>
           <w:color w:val="2C2C2A"/>
         </w:rPr>
-        <w:t>Um estagiário calculou a média de vendas por dia da semana agrupando diretamente a tabela orders, e concluiu que Domingo era o melhor dia (média de R$ 5.000,00). O problema: em muitos domingos a loja abriu mas vendeu zero — e, como esses dias não geram nenhuma linha em orders, eles foram silenciosamente excluídos do cálculo, inflando artificialmente a média.</w:t>
+        <w:t xml:space="preserve">Um estagiário calculou a média de vendas por dia da semana agrupando diretamente a tabela </w:t>
+      </w:r>
+      <w:proofErr w:type="spellStart"/>
+      <w:r>
+        <w:rPr>
+          <w:color w:val="2C2C2A"/>
+        </w:rPr>
+        <w:t>orders</w:t>
+      </w:r>
+      <w:proofErr w:type="spellEnd"/>
+      <w:r>
+        <w:rPr>
+          <w:color w:val="2C2C2A"/>
+        </w:rPr>
+        <w:t xml:space="preserve">, e concluiu que Domingo era o melhor dia (média de R$ 5.000,00). O problema: em muitos domingos a loja </w:t>
+      </w:r>
+      <w:proofErr w:type="gramStart"/>
+      <w:r>
+        <w:rPr>
+          <w:color w:val="2C2C2A"/>
+        </w:rPr>
+        <w:t>abriu</w:t>
+      </w:r>
+      <w:proofErr w:type="gramEnd"/>
+      <w:r>
+        <w:rPr>
+          <w:color w:val="2C2C2A"/>
+        </w:rPr>
+        <w:t xml:space="preserve"> mas vendeu zero — e, como esses dias não geram nenhuma linha em </w:t>
+      </w:r>
+      <w:proofErr w:type="spellStart"/>
+      <w:r>
+        <w:rPr>
+          <w:color w:val="2C2C2A"/>
+        </w:rPr>
+        <w:t>orders</w:t>
+      </w:r>
+      <w:proofErr w:type="spellEnd"/>
+      <w:r>
+        <w:rPr>
+          <w:color w:val="2C2C2A"/>
+        </w:rPr>
+        <w:t>, eles foram silenciosamente excluídos do cálculo, inflando artificialmente a média.</w:t>
       </w:r>
     </w:p>
     <w:p>
@@ -4451,7 +5082,63 @@
         <w:rPr>
           <w:color w:val="2C2C2A"/>
         </w:rPr>
-        <w:t>Uma dimensão de calendário foi construída via generate_series(), cobrindo todos os dias entre a menor e a maior data de venda (2.557 dias). Essa dimensão foi então cruzada com as vendas de lojas físicas (channel = 'pos') via LEFT JOIN, substituindo dias sem venda por 0 (COALESCE) — garantindo que todo dia do calendário, com ou sem venda, entrasse no cálculo da média.</w:t>
+        <w:t xml:space="preserve">Uma dimensão de calendário foi construída via </w:t>
+      </w:r>
+      <w:proofErr w:type="spellStart"/>
+      <w:r>
+        <w:rPr>
+          <w:color w:val="2C2C2A"/>
+        </w:rPr>
+        <w:t>generate_</w:t>
+      </w:r>
+      <w:proofErr w:type="gramStart"/>
+      <w:r>
+        <w:rPr>
+          <w:color w:val="2C2C2A"/>
+        </w:rPr>
+        <w:t>series</w:t>
+      </w:r>
+      <w:proofErr w:type="spellEnd"/>
+      <w:r>
+        <w:rPr>
+          <w:color w:val="2C2C2A"/>
+        </w:rPr>
+        <w:t>(</w:t>
+      </w:r>
+      <w:proofErr w:type="gramEnd"/>
+      <w:r>
+        <w:rPr>
+          <w:color w:val="2C2C2A"/>
+        </w:rPr>
+        <w:t>), cobrindo todos os dias entre a menor e a maior data de venda (2.557 dias). Essa dimensão foi então cruzada com as vendas de lojas físicas (</w:t>
+      </w:r>
+      <w:proofErr w:type="spellStart"/>
+      <w:r>
+        <w:rPr>
+          <w:color w:val="2C2C2A"/>
+        </w:rPr>
+        <w:t>channel</w:t>
+      </w:r>
+      <w:proofErr w:type="spellEnd"/>
+      <w:r>
+        <w:rPr>
+          <w:color w:val="2C2C2A"/>
+        </w:rPr>
+        <w:t xml:space="preserve"> = '</w:t>
+      </w:r>
+      <w:proofErr w:type="spellStart"/>
+      <w:r>
+        <w:rPr>
+          <w:color w:val="2C2C2A"/>
+        </w:rPr>
+        <w:t>pos</w:t>
+      </w:r>
+      <w:proofErr w:type="spellEnd"/>
+      <w:r>
+        <w:rPr>
+          <w:color w:val="2C2C2A"/>
+        </w:rPr>
+        <w:t>') via LEFT JOIN, substituindo dias sem venda por 0 (COALESCE) — garantindo que todo dia do calendário, com ou sem venda, entrasse no cálculo da média.</w:t>
       </w:r>
     </w:p>
     <w:p>
@@ -4492,12 +5179,6 @@
         <w:gridCol w:w="3400"/>
       </w:tblGrid>
       <w:tr>
-        <w:tblPrEx>
-          <w:tblCellMar>
-            <w:top w:w="0" w:type="dxa"/>
-            <w:bottom w:w="0" w:type="dxa"/>
-          </w:tblCellMar>
-        </w:tblPrEx>
         <w:trPr>
           <w:tblHeader/>
         </w:trPr>
@@ -4584,12 +5265,6 @@
         </w:tc>
       </w:tr>
       <w:tr>
-        <w:tblPrEx>
-          <w:tblCellMar>
-            <w:top w:w="0" w:type="dxa"/>
-            <w:bottom w:w="0" w:type="dxa"/>
-          </w:tblCellMar>
-        </w:tblPrEx>
         <w:tc>
           <w:tcPr>
             <w:tcW w:w="2600" w:type="dxa"/>
@@ -4664,12 +5339,6 @@
         </w:tc>
       </w:tr>
       <w:tr>
-        <w:tblPrEx>
-          <w:tblCellMar>
-            <w:top w:w="0" w:type="dxa"/>
-            <w:bottom w:w="0" w:type="dxa"/>
-          </w:tblCellMar>
-        </w:tblPrEx>
         <w:tc>
           <w:tcPr>
             <w:tcW w:w="2600" w:type="dxa"/>
@@ -4747,12 +5416,6 @@
         </w:tc>
       </w:tr>
       <w:tr>
-        <w:tblPrEx>
-          <w:tblCellMar>
-            <w:top w:w="0" w:type="dxa"/>
-            <w:bottom w:w="0" w:type="dxa"/>
-          </w:tblCellMar>
-        </w:tblPrEx>
         <w:tc>
           <w:tcPr>
             <w:tcW w:w="2600" w:type="dxa"/>
@@ -4827,12 +5490,6 @@
         </w:tc>
       </w:tr>
       <w:tr>
-        <w:tblPrEx>
-          <w:tblCellMar>
-            <w:top w:w="0" w:type="dxa"/>
-            <w:bottom w:w="0" w:type="dxa"/>
-          </w:tblCellMar>
-        </w:tblPrEx>
         <w:tc>
           <w:tcPr>
             <w:tcW w:w="2600" w:type="dxa"/>
@@ -4910,12 +5567,6 @@
         </w:tc>
       </w:tr>
       <w:tr>
-        <w:tblPrEx>
-          <w:tblCellMar>
-            <w:top w:w="0" w:type="dxa"/>
-            <w:bottom w:w="0" w:type="dxa"/>
-          </w:tblCellMar>
-        </w:tblPrEx>
         <w:tc>
           <w:tcPr>
             <w:tcW w:w="2600" w:type="dxa"/>
@@ -4990,12 +5641,6 @@
         </w:tc>
       </w:tr>
       <w:tr>
-        <w:tblPrEx>
-          <w:tblCellMar>
-            <w:top w:w="0" w:type="dxa"/>
-            <w:bottom w:w="0" w:type="dxa"/>
-          </w:tblCellMar>
-        </w:tblPrEx>
         <w:tc>
           <w:tcPr>
             <w:tcW w:w="2600" w:type="dxa"/>
@@ -5073,12 +5718,6 @@
         </w:tc>
       </w:tr>
       <w:tr>
-        <w:tblPrEx>
-          <w:tblCellMar>
-            <w:top w:w="0" w:type="dxa"/>
-            <w:bottom w:w="0" w:type="dxa"/>
-          </w:tblCellMar>
-        </w:tblPrEx>
         <w:tc>
           <w:tcPr>
             <w:tcW w:w="2600" w:type="dxa"/>
@@ -5344,7 +5983,49 @@
         <w:rPr>
           <w:color w:val="2C2C2A"/>
         </w:rPr>
-        <w:t>Antes de construir o modelo, foi identificado que existem dois produtos distintos na base (product_id 74 e 240), com SKUs, preços e histórico de vendas próprios, mas exatamente o mesmo nome: "Bússola de Bordo 702". Ambos têm vendas desde 2020, descartando a hipótese de um ser sucessor do outro — é aparentemente uma falha de cadastro no ERP de origem. Como o enunciado se refere ao produto pelo nome, a decisão foi agregar as vendas de ambos os product_id como uma única série temporal, documentando essa ambiguidade para o time de dados investigar.</w:t>
+        <w:t>Antes de construir o modelo, foi identificado que existem dois produtos distintos na base (</w:t>
+      </w:r>
+      <w:proofErr w:type="spellStart"/>
+      <w:r>
+        <w:rPr>
+          <w:color w:val="2C2C2A"/>
+        </w:rPr>
+        <w:t>product_id</w:t>
+      </w:r>
+      <w:proofErr w:type="spellEnd"/>
+      <w:r>
+        <w:rPr>
+          <w:color w:val="2C2C2A"/>
+        </w:rPr>
+        <w:t xml:space="preserve"> 74 e 240), com </w:t>
+      </w:r>
+      <w:proofErr w:type="spellStart"/>
+      <w:r>
+        <w:rPr>
+          <w:color w:val="2C2C2A"/>
+        </w:rPr>
+        <w:t>SKUs</w:t>
+      </w:r>
+      <w:proofErr w:type="spellEnd"/>
+      <w:r>
+        <w:rPr>
+          <w:color w:val="2C2C2A"/>
+        </w:rPr>
+        <w:t xml:space="preserve">, preços e histórico de vendas próprios, mas exatamente o mesmo nome: "Bússola de Bordo 702". Ambos têm vendas desde 2020, descartando a hipótese de um ser sucessor do outro — é aparentemente uma falha de cadastro no ERP de origem. Como o enunciado se refere ao produto pelo nome, a decisão foi agregar as vendas de ambos os </w:t>
+      </w:r>
+      <w:proofErr w:type="spellStart"/>
+      <w:r>
+        <w:rPr>
+          <w:color w:val="2C2C2A"/>
+        </w:rPr>
+        <w:t>product_id</w:t>
+      </w:r>
+      <w:proofErr w:type="spellEnd"/>
+      <w:r>
+        <w:rPr>
+          <w:color w:val="2C2C2A"/>
+        </w:rPr>
+        <w:t xml:space="preserve"> como uma única série temporal, documentando essa ambiguidade para o time de dados investigar.</w:t>
       </w:r>
     </w:p>
     <w:p>
@@ -5370,7 +6051,105 @@
         <w:rPr>
           <w:color w:val="2C2C2A"/>
         </w:rPr>
-        <w:t>Um script Python (psycopg2 para consultar o banco) construiu a série mensal de vendas do produto, unindo orders, order_items, product_variants e products. O baseline utilizado foi uma média móvel de 3 meses, sempre considerando apenas dados anteriores à data prevista (sem data leakage) — um rolling forecast onde o valor real de cada mês, assim que conhecido, passa a integrar a janela do mês seguinte.</w:t>
+        <w:t xml:space="preserve">Um script Python (psycopg2 para consultar o banco) construiu a série mensal de vendas do produto, unindo </w:t>
+      </w:r>
+      <w:proofErr w:type="spellStart"/>
+      <w:r>
+        <w:rPr>
+          <w:color w:val="2C2C2A"/>
+        </w:rPr>
+        <w:t>orders</w:t>
+      </w:r>
+      <w:proofErr w:type="spellEnd"/>
+      <w:r>
+        <w:rPr>
+          <w:color w:val="2C2C2A"/>
+        </w:rPr>
+        <w:t xml:space="preserve">, </w:t>
+      </w:r>
+      <w:proofErr w:type="spellStart"/>
+      <w:r>
+        <w:rPr>
+          <w:color w:val="2C2C2A"/>
+        </w:rPr>
+        <w:t>order_items</w:t>
+      </w:r>
+      <w:proofErr w:type="spellEnd"/>
+      <w:r>
+        <w:rPr>
+          <w:color w:val="2C2C2A"/>
+        </w:rPr>
+        <w:t xml:space="preserve">, </w:t>
+      </w:r>
+      <w:proofErr w:type="spellStart"/>
+      <w:r>
+        <w:rPr>
+          <w:color w:val="2C2C2A"/>
+        </w:rPr>
+        <w:t>product_variants</w:t>
+      </w:r>
+      <w:proofErr w:type="spellEnd"/>
+      <w:r>
+        <w:rPr>
+          <w:color w:val="2C2C2A"/>
+        </w:rPr>
+        <w:t xml:space="preserve"> e </w:t>
+      </w:r>
+      <w:proofErr w:type="spellStart"/>
+      <w:r>
+        <w:rPr>
+          <w:color w:val="2C2C2A"/>
+        </w:rPr>
+        <w:t>products</w:t>
+      </w:r>
+      <w:proofErr w:type="spellEnd"/>
+      <w:r>
+        <w:rPr>
+          <w:color w:val="2C2C2A"/>
+        </w:rPr>
+        <w:t xml:space="preserve">. O baseline utilizado foi uma média móvel de 3 meses, sempre considerando apenas dados anteriores à data prevista (sem data </w:t>
+      </w:r>
+      <w:proofErr w:type="spellStart"/>
+      <w:r>
+        <w:rPr>
+          <w:color w:val="2C2C2A"/>
+        </w:rPr>
+        <w:t>leakage</w:t>
+      </w:r>
+      <w:proofErr w:type="spellEnd"/>
+      <w:r>
+        <w:rPr>
+          <w:color w:val="2C2C2A"/>
+        </w:rPr>
+        <w:t xml:space="preserve">) — um </w:t>
+      </w:r>
+      <w:proofErr w:type="spellStart"/>
+      <w:r>
+        <w:rPr>
+          <w:color w:val="2C2C2A"/>
+        </w:rPr>
+        <w:t>rolling</w:t>
+      </w:r>
+      <w:proofErr w:type="spellEnd"/>
+      <w:r>
+        <w:rPr>
+          <w:color w:val="2C2C2A"/>
+        </w:rPr>
+        <w:t xml:space="preserve"> </w:t>
+      </w:r>
+      <w:proofErr w:type="spellStart"/>
+      <w:r>
+        <w:rPr>
+          <w:color w:val="2C2C2A"/>
+        </w:rPr>
+        <w:t>forecast</w:t>
+      </w:r>
+      <w:proofErr w:type="spellEnd"/>
+      <w:r>
+        <w:rPr>
+          <w:color w:val="2C2C2A"/>
+        </w:rPr>
+        <w:t xml:space="preserve"> onde o valor real de cada mês, assim que conhecido, passa a integrar a janela do mês seguinte.</w:t>
       </w:r>
     </w:p>
     <w:p>
@@ -5412,12 +6191,6 @@
         <w:gridCol w:w="1600"/>
       </w:tblGrid>
       <w:tr>
-        <w:tblPrEx>
-          <w:tblCellMar>
-            <w:top w:w="0" w:type="dxa"/>
-            <w:bottom w:w="0" w:type="dxa"/>
-          </w:tblCellMar>
-        </w:tblPrEx>
         <w:trPr>
           <w:tblHeader/>
         </w:trPr>
@@ -5532,12 +6305,6 @@
         </w:tc>
       </w:tr>
       <w:tr>
-        <w:tblPrEx>
-          <w:tblCellMar>
-            <w:top w:w="0" w:type="dxa"/>
-            <w:bottom w:w="0" w:type="dxa"/>
-          </w:tblCellMar>
-        </w:tblPrEx>
         <w:tc>
           <w:tcPr>
             <w:tcW w:w="2600" w:type="dxa"/>
@@ -5637,12 +6404,6 @@
         </w:tc>
       </w:tr>
       <w:tr>
-        <w:tblPrEx>
-          <w:tblCellMar>
-            <w:top w:w="0" w:type="dxa"/>
-            <w:bottom w:w="0" w:type="dxa"/>
-          </w:tblCellMar>
-        </w:tblPrEx>
         <w:tc>
           <w:tcPr>
             <w:tcW w:w="2600" w:type="dxa"/>
@@ -5746,12 +6507,6 @@
         </w:tc>
       </w:tr>
       <w:tr>
-        <w:tblPrEx>
-          <w:tblCellMar>
-            <w:top w:w="0" w:type="dxa"/>
-            <w:bottom w:w="0" w:type="dxa"/>
-          </w:tblCellMar>
-        </w:tblPrEx>
         <w:tc>
           <w:tcPr>
             <w:tcW w:w="2600" w:type="dxa"/>
@@ -5851,12 +6606,6 @@
         </w:tc>
       </w:tr>
       <w:tr>
-        <w:tblPrEx>
-          <w:tblCellMar>
-            <w:top w:w="0" w:type="dxa"/>
-            <w:bottom w:w="0" w:type="dxa"/>
-          </w:tblCellMar>
-        </w:tblPrEx>
         <w:tc>
           <w:tcPr>
             <w:tcW w:w="2600" w:type="dxa"/>
@@ -6063,7 +6812,43 @@
           <w:bCs/>
           <w:color w:val="2C2C2A"/>
         </w:rPr>
-        <w:t xml:space="preserve">MAE (Mean Absolute Error): </w:t>
+        <w:t>MAE (</w:t>
+      </w:r>
+      <w:proofErr w:type="spellStart"/>
+      <w:r>
+        <w:rPr>
+          <w:b/>
+          <w:bCs/>
+          <w:color w:val="2C2C2A"/>
+        </w:rPr>
+        <w:t>Mean</w:t>
+      </w:r>
+      <w:proofErr w:type="spellEnd"/>
+      <w:r>
+        <w:rPr>
+          <w:b/>
+          <w:bCs/>
+          <w:color w:val="2C2C2A"/>
+        </w:rPr>
+        <w:t xml:space="preserve"> Absolute </w:t>
+      </w:r>
+      <w:proofErr w:type="spellStart"/>
+      <w:r>
+        <w:rPr>
+          <w:b/>
+          <w:bCs/>
+          <w:color w:val="2C2C2A"/>
+        </w:rPr>
+        <w:t>Error</w:t>
+      </w:r>
+      <w:proofErr w:type="spellEnd"/>
+      <w:r>
+        <w:rPr>
+          <w:b/>
+          <w:bCs/>
+          <w:color w:val="2C2C2A"/>
+        </w:rPr>
+        <w:t xml:space="preserve">): </w:t>
       </w:r>
       <w:r>
         <w:rPr>
@@ -6204,7 +6989,35 @@
         <w:rPr>
           <w:color w:val="2C2C2A"/>
         </w:rPr>
-        <w:t>Uma matriz de interação Usuário × Produto foi construída com pandas (1 se o cliente comprou o produto ao menos uma vez, 0 caso contrário — ignorando quantidade). A partir dela, a similaridade de cosseno entre produtos foi calculada com scikit-learn (cosine_similarity), comparando os vetores de clientes que compraram cada par de produtos.</w:t>
+        <w:t xml:space="preserve">Uma matriz de interação Usuário × Produto foi construída com pandas (1 se o cliente comprou o produto ao menos uma vez, 0 caso contrário — ignorando quantidade). A partir dela, a similaridade de cosseno entre produtos foi calculada com </w:t>
+      </w:r>
+      <w:proofErr w:type="spellStart"/>
+      <w:r>
+        <w:rPr>
+          <w:color w:val="2C2C2A"/>
+        </w:rPr>
+        <w:t>scikit-learn</w:t>
+      </w:r>
+      <w:proofErr w:type="spellEnd"/>
+      <w:r>
+        <w:rPr>
+          <w:color w:val="2C2C2A"/>
+        </w:rPr>
+        <w:t xml:space="preserve"> (</w:t>
+      </w:r>
+      <w:proofErr w:type="spellStart"/>
+      <w:r>
+        <w:rPr>
+          <w:color w:val="2C2C2A"/>
+        </w:rPr>
+        <w:t>cosine_similarity</w:t>
+      </w:r>
+      <w:proofErr w:type="spellEnd"/>
+      <w:r>
+        <w:rPr>
+          <w:color w:val="2C2C2A"/>
+        </w:rPr>
+        <w:t>), comparando os vetores de clientes que compraram cada par de produtos.</w:t>
       </w:r>
     </w:p>
     <w:p>
@@ -6256,12 +7069,6 @@
         <w:gridCol w:w="3200"/>
       </w:tblGrid>
       <w:tr>
-        <w:tblPrEx>
-          <w:tblCellMar>
-            <w:top w:w="0" w:type="dxa"/>
-            <w:bottom w:w="0" w:type="dxa"/>
-          </w:tblCellMar>
-        </w:tblPrEx>
         <w:trPr>
           <w:tblHeader/>
         </w:trPr>
@@ -6348,12 +7155,6 @@
         </w:tc>
       </w:tr>
       <w:tr>
-        <w:tblPrEx>
-          <w:tblCellMar>
-            <w:top w:w="0" w:type="dxa"/>
-            <w:bottom w:w="0" w:type="dxa"/>
-          </w:tblCellMar>
-        </w:tblPrEx>
         <w:tc>
           <w:tcPr>
             <w:tcW w:w="1400" w:type="dxa"/>
@@ -6428,12 +7229,6 @@
         </w:tc>
       </w:tr>
       <w:tr>
-        <w:tblPrEx>
-          <w:tblCellMar>
-            <w:top w:w="0" w:type="dxa"/>
-            <w:bottom w:w="0" w:type="dxa"/>
-          </w:tblCellMar>
-        </w:tblPrEx>
         <w:tc>
           <w:tcPr>
             <w:tcW w:w="1400" w:type="dxa"/>
@@ -6511,12 +7306,6 @@
         </w:tc>
       </w:tr>
       <w:tr>
-        <w:tblPrEx>
-          <w:tblCellMar>
-            <w:top w:w="0" w:type="dxa"/>
-            <w:bottom w:w="0" w:type="dxa"/>
-          </w:tblCellMar>
-        </w:tblPrEx>
         <w:tc>
           <w:tcPr>
             <w:tcW w:w="1400" w:type="dxa"/>
@@ -6591,12 +7380,6 @@
         </w:tc>
       </w:tr>
       <w:tr>
-        <w:tblPrEx>
-          <w:tblCellMar>
-            <w:top w:w="0" w:type="dxa"/>
-            <w:bottom w:w="0" w:type="dxa"/>
-          </w:tblCellMar>
-        </w:tblPrEx>
         <w:tc>
           <w:tcPr>
             <w:tcW w:w="1400" w:type="dxa"/>
@@ -6674,12 +7457,6 @@
         </w:tc>
       </w:tr>
       <w:tr>
-        <w:tblPrEx>
-          <w:tblCellMar>
-            <w:top w:w="0" w:type="dxa"/>
-            <w:bottom w:w="0" w:type="dxa"/>
-          </w:tblCellMar>
-        </w:tblPrEx>
         <w:tc>
           <w:tcPr>
             <w:tcW w:w="1400" w:type="dxa"/>
@@ -6918,7 +7695,35 @@
         <w:rPr>
           <w:color w:val="2C2C2A"/>
         </w:rPr>
-        <w:t>O modelo captura correlação estatística de compra, mas não tem nenhum mecanismo para incorporar conhecimento de domínio — ele não "sabe" que um motor e uma defensa são fisicamente complementares (um protege o barco onde o outro é instalado); só enxerga o padrão de compra histórico. É por isso que o resultado aponta outro motor de popa, e não uma defensa como a Marina hipotetizou: é uma limitação estrutural de qualquer recomendação baseada apenas em co-ocorrência de compra, sem contexto de produto.</w:t>
+        <w:t xml:space="preserve">O modelo captura correlação estatística de compra, mas não tem nenhum mecanismo para incorporar conhecimento de domínio — ele não "sabe" que um motor e uma defensa são fisicamente complementares (um protege o barco onde o outro é instalado); só enxerga o padrão de compra histórico. É por isso que o resultado aponta outro motor de popa, e não uma defensa como a Marina </w:t>
+      </w:r>
+      <w:proofErr w:type="spellStart"/>
+      <w:r>
+        <w:rPr>
+          <w:color w:val="2C2C2A"/>
+        </w:rPr>
+        <w:t>hipotetizou</w:t>
+      </w:r>
+      <w:proofErr w:type="spellEnd"/>
+      <w:r>
+        <w:rPr>
+          <w:color w:val="2C2C2A"/>
+        </w:rPr>
+        <w:t xml:space="preserve">: é uma limitação estrutural de qualquer recomendação baseada apenas em </w:t>
+      </w:r>
+      <w:proofErr w:type="spellStart"/>
+      <w:r>
+        <w:rPr>
+          <w:color w:val="2C2C2A"/>
+        </w:rPr>
+        <w:t>co-ocorrência</w:t>
+      </w:r>
+      <w:proofErr w:type="spellEnd"/>
+      <w:r>
+        <w:rPr>
+          <w:color w:val="2C2C2A"/>
+        </w:rPr>
+        <w:t xml:space="preserve"> de compra, sem contexto de produto.</w:t>
       </w:r>
     </w:p>
     <w:p>
@@ -6999,7 +7804,21 @@
         <w:rPr>
           <w:color w:val="2C2C2A"/>
         </w:rPr>
-        <w:t>O modelo de previsão de demanda e o sistema de recomendação são, ambos, ferramentas úteis mas limitadas: eles substituem o "feeling" por uma metodologia auditável, mas exigem acompanhamento humano — o baseline de média móvel tende a errar em períodos de mudança de tendência, e a recomendação por similaridade não capta complementaridade física de produtos.</w:t>
+        <w:t xml:space="preserve">O modelo de previsão de demanda e o sistema de recomendação são, ambos, ferramentas </w:t>
+      </w:r>
+      <w:proofErr w:type="gramStart"/>
+      <w:r>
+        <w:rPr>
+          <w:color w:val="2C2C2A"/>
+        </w:rPr>
+        <w:t>úteis</w:t>
+      </w:r>
+      <w:proofErr w:type="gramEnd"/>
+      <w:r>
+        <w:rPr>
+          <w:color w:val="2C2C2A"/>
+        </w:rPr>
+        <w:t xml:space="preserve"> mas limitadas: eles substituem o "feeling" por uma metodologia auditável, mas exigem acompanhamento humano — o baseline de média móvel tende a errar em períodos de mudança de tendência, e a recomendação por similaridade não capta complementaridade física de produtos.</w:t>
       </w:r>
     </w:p>
     <w:p>
@@ -7030,7 +7849,21 @@
         <w:rPr>
           <w:color w:val="2C2C2A"/>
         </w:rPr>
-        <w:t>Investigar e corrigir a duplicidade de cadastro identificada (produto "Bússola de Bordo 702" com dois IDs distintos) e auditar se há outros casos semelhantes na base.</w:t>
+        <w:t xml:space="preserve">Investigar e corrigir a duplicidade de cadastro identificada (produto "Bússola de Bordo 702" com dois </w:t>
+      </w:r>
+      <w:proofErr w:type="spellStart"/>
+      <w:r>
+        <w:rPr>
+          <w:color w:val="2C2C2A"/>
+        </w:rPr>
+        <w:t>IDs</w:t>
+      </w:r>
+      <w:proofErr w:type="spellEnd"/>
+      <w:r>
+        <w:rPr>
+          <w:color w:val="2C2C2A"/>
+        </w:rPr>
+        <w:t xml:space="preserve"> distintos) e auditar se há outros casos semelhantes na base.</w:t>
       </w:r>
     </w:p>
     <w:p>
@@ -7046,7 +7879,21 @@
         <w:rPr>
           <w:color w:val="2C2C2A"/>
         </w:rPr>
-        <w:t>Evoluir o modelo de previsão de demanda para incorporar sazonalidade (ex: médias móveis ponderadas por período do ano, ou modelos que decomponham tendência e sazonalidade), reduzindo o risco de ruptura de estoque em períodos de alta.</w:t>
+        <w:t>Evoluir o modelo de previsão de demanda para incorporar sazonalidade (</w:t>
+      </w:r>
+      <w:proofErr w:type="spellStart"/>
+      <w:r>
+        <w:rPr>
+          <w:color w:val="2C2C2A"/>
+        </w:rPr>
+        <w:t>ex</w:t>
+      </w:r>
+      <w:proofErr w:type="spellEnd"/>
+      <w:r>
+        <w:rPr>
+          <w:color w:val="2C2C2A"/>
+        </w:rPr>
+        <w:t>: médias móveis ponderadas por período do ano, ou modelos que decomponham tendência e sazonalidade), reduzindo o risco de ruptura de estoque em períodos de alta.</w:t>
       </w:r>
     </w:p>
     <w:p>
@@ -7062,7 +7909,21 @@
         <w:rPr>
           <w:color w:val="2C2C2A"/>
         </w:rPr>
-        <w:t>Complementar o sistema de recomendação por similaridade com regras de negócio manuais para categorias de complementaridade física conhecida (ex: motor + defensa, lancha + colete salva-vidas), já que o modelo estatístico sozinho não capta esse tipo de relação.</w:t>
+        <w:t>Complementar o sistema de recomendação por similaridade com regras de negócio manuais para categorias de complementaridade física conhecida (</w:t>
+      </w:r>
+      <w:proofErr w:type="spellStart"/>
+      <w:r>
+        <w:rPr>
+          <w:color w:val="2C2C2A"/>
+        </w:rPr>
+        <w:t>ex</w:t>
+      </w:r>
+      <w:proofErr w:type="spellEnd"/>
+      <w:r>
+        <w:rPr>
+          <w:color w:val="2C2C2A"/>
+        </w:rPr>
+        <w:t>: motor + defensa, lancha + colete salva-vidas), já que o modelo estatístico sozinho não capta esse tipo de relação.</w:t>
       </w:r>
     </w:p>
     <w:p>
@@ -7078,7 +7939,21 @@
         <w:rPr>
           <w:color w:val="2C2C2A"/>
         </w:rPr>
-        <w:t>Esclarecer a data futura encontrada na EDA inicial (created_at até 31/12/2026) antes de qualquer análise temporal ser usada em decisões de produção real.</w:t>
+        <w:t>Esclarecer a data futura encontrada na EDA inicial (</w:t>
+      </w:r>
+      <w:proofErr w:type="spellStart"/>
+      <w:r>
+        <w:rPr>
+          <w:color w:val="2C2C2A"/>
+        </w:rPr>
+        <w:t>created_at</w:t>
+      </w:r>
+      <w:proofErr w:type="spellEnd"/>
+      <w:r>
+        <w:rPr>
+          <w:color w:val="2C2C2A"/>
+        </w:rPr>
+        <w:t xml:space="preserve"> até 31/12/2026) antes de qualquer análise temporal ser usada em decisões de produção real.</w:t>
       </w:r>
     </w:p>
     <w:sectPr>

</xml_diff>